<commit_message>
Booklet: tables in order, Table 1 first
Co-Authored-By: Claude Fable 5.1 <noreply@anthropic.com>
Claude-Session: https://claude.ai/code/session_019gyiige9BuJUj3e3kcjvaS
</commit_message>
<xml_diff>
--- a/curious-incident/files/Curious Incident Speaking Folio.docx
+++ b/curious-incident/files/Curious Incident Speaking Folio.docx
@@ -2056,155 +2056,53 @@
         </w:trPr>
         <w:tc>
           <w:tcPr>
-            <w:tcW w:type="dxa" w:w="4200"/>
-            <w:tcBorders>
-              <w:top w:val="single" w:color="808080" w:sz="4"/>
-              <w:left w:val="single" w:color="808080" w:sz="4"/>
-              <w:bottom w:val="single" w:color="808080" w:sz="4"/>
-              <w:right w:val="single" w:color="808080" w:sz="4"/>
-            </w:tcBorders>
-            <w:tcMar>
-              <w:top w:type="dxa" w:w="50"/>
-              <w:left w:type="dxa" w:w="90"/>
-              <w:bottom w:type="dxa" w:w="50"/>
-              <w:right w:type="dxa" w:w="90"/>
-            </w:tcMar>
-          </w:tcPr>
-          <w:p>
-            <w:pPr>
-              <w:spacing w:after="20" w:before="0"/>
-            </w:pPr>
-            <w:r>
-              <w:rPr>
-                <w:rFonts w:ascii="Aptos Narrow" w:cs="Aptos Narrow" w:eastAsia="Aptos Narrow" w:hAnsi="Aptos Narrow"/>
-                <w:b/>
-                <w:bCs/>
-                <w:color w:val="70243C"/>
+            <w:tcW w:type="dxa" w:w="15398"/>
+            <w:gridSpan w:val="4"/>
+            <w:tcBorders>
+              <w:top w:val="single" w:color="808080" w:sz="4"/>
+              <w:left w:val="single" w:color="808080" w:sz="4"/>
+              <w:bottom w:val="single" w:color="808080" w:sz="4"/>
+              <w:right w:val="single" w:color="808080" w:sz="4"/>
+            </w:tcBorders>
+            <w:shd w:fill="F2F2F2" w:color="auto" w:val="clear"/>
+            <w:tcMar>
+              <w:top w:type="dxa" w:w="50"/>
+              <w:left w:type="dxa" w:w="90"/>
+              <w:bottom w:type="dxa" w:w="50"/>
+              <w:right w:type="dxa" w:w="90"/>
+            </w:tcMar>
+            <w:vAlign w:val="center"/>
+          </w:tcPr>
+          <w:p>
+            <w:pPr>
+              <w:spacing w:after="40" w:before="0"/>
+              <w:jc w:val="center"/>
+            </w:pPr>
+            <w:r>
+              <w:rPr>
+                <w:rFonts w:ascii="Aptos Narrow" w:cs="Aptos Narrow" w:eastAsia="Aptos Narrow" w:hAnsi="Aptos Narrow"/>
+                <w:b/>
+                <w:bCs/>
+                <w:color w:val="595959"/>
+                <w:sz w:val="22"/>
+                <w:szCs w:val="22"/>
+              </w:rPr>
+              <w:t xml:space="preserve">Table 1 · Teacher table</w:t>
+            </w:r>
+          </w:p>
+          <w:p>
+            <w:pPr>
+              <w:spacing w:after="0" w:before="0"/>
+              <w:jc w:val="center"/>
+            </w:pPr>
+            <w:r>
+              <w:rPr>
+                <w:rFonts w:ascii="Aptos Narrow" w:cs="Aptos Narrow" w:eastAsia="Aptos Narrow" w:hAnsi="Aptos Narrow"/>
+                <w:color w:val="595959"/>
                 <w:sz w:val="20"/>
                 <w:szCs w:val="20"/>
               </w:rPr>
-              <w:t xml:space="preserve">Table 2</w:t>
-            </w:r>
-          </w:p>
-          <w:p>
-            <w:pPr>
-              <w:spacing w:after="20" w:before="0"/>
-            </w:pPr>
-            <w:r>
-              <w:rPr>
-                <w:rFonts w:ascii="Georgia" w:cs="Georgia" w:eastAsia="Georgia" w:hAnsi="Georgia"/>
-                <w:color w:val="1F1F1F"/>
-                <w:sz w:val="19"/>
-                <w:szCs w:val="19"/>
-              </w:rPr>
-              <w:t xml:space="preserve">I find people confusing. This is for two main reasons. The first main reason is that people do a lot of talking without using any words.</w:t>
-            </w:r>
-          </w:p>
-          <w:p>
-            <w:pPr>
-              <w:spacing w:after="0" w:before="0"/>
-            </w:pPr>
-            <w:r>
-              <w:rPr>
-                <w:rFonts w:ascii="Aptos Narrow" w:cs="Aptos Narrow" w:eastAsia="Aptos Narrow" w:hAnsi="Aptos Narrow"/>
-                <w:color w:val="595959"/>
-                <w:sz w:val="16"/>
-                <w:szCs w:val="16"/>
-              </w:rPr>
-              <w:t xml:space="preserve">Chapter 5</w:t>
-            </w:r>
-          </w:p>
-        </w:tc>
-        <w:tc>
-          <w:tcPr>
-            <w:tcW w:type="dxa" w:w="2300"/>
-            <w:tcBorders>
-              <w:top w:val="single" w:color="808080" w:sz="4"/>
-              <w:left w:val="single" w:color="808080" w:sz="4"/>
-              <w:bottom w:val="single" w:color="808080" w:sz="4"/>
-              <w:right w:val="single" w:color="808080" w:sz="4"/>
-            </w:tcBorders>
-            <w:tcMar>
-              <w:top w:type="dxa" w:w="50"/>
-              <w:left w:type="dxa" w:w="90"/>
-              <w:bottom w:type="dxa" w:w="50"/>
-              <w:right w:type="dxa" w:w="90"/>
-            </w:tcMar>
-          </w:tcPr>
-          <w:p>
-            <w:pPr>
-              <w:spacing w:after="0" w:before="0"/>
-            </w:pPr>
-            <w:r>
-              <w:rPr>
-                <w:rFonts w:ascii="Aptos Narrow" w:cs="Aptos Narrow" w:eastAsia="Aptos Narrow" w:hAnsi="Aptos Narrow"/>
-                <w:color w:val="1F1F1F"/>
-                <w:sz w:val="22"/>
-                <w:szCs w:val="22"/>
-              </w:rPr>
-              <w:t xml:space="preserve"/>
-            </w:r>
-          </w:p>
-        </w:tc>
-        <w:tc>
-          <w:tcPr>
-            <w:tcW w:type="dxa" w:w="5100"/>
-            <w:tcBorders>
-              <w:top w:val="single" w:color="808080" w:sz="4"/>
-              <w:left w:val="single" w:color="808080" w:sz="4"/>
-              <w:bottom w:val="single" w:color="808080" w:sz="4"/>
-              <w:right w:val="single" w:color="808080" w:sz="4"/>
-            </w:tcBorders>
-            <w:tcMar>
-              <w:top w:type="dxa" w:w="50"/>
-              <w:left w:type="dxa" w:w="90"/>
-              <w:bottom w:type="dxa" w:w="50"/>
-              <w:right w:type="dxa" w:w="90"/>
-            </w:tcMar>
-          </w:tcPr>
-          <w:p>
-            <w:pPr>
-              <w:spacing w:after="0" w:before="0"/>
-            </w:pPr>
-            <w:r>
-              <w:rPr>
-                <w:rFonts w:ascii="Aptos Narrow" w:cs="Aptos Narrow" w:eastAsia="Aptos Narrow" w:hAnsi="Aptos Narrow"/>
-                <w:color w:val="1F1F1F"/>
-                <w:sz w:val="22"/>
-                <w:szCs w:val="22"/>
-              </w:rPr>
-              <w:t xml:space="preserve"/>
-            </w:r>
-          </w:p>
-        </w:tc>
-        <w:tc>
-          <w:tcPr>
-            <w:tcW w:type="dxa" w:w="3798"/>
-            <w:tcBorders>
-              <w:top w:val="single" w:color="808080" w:sz="4"/>
-              <w:left w:val="single" w:color="808080" w:sz="4"/>
-              <w:bottom w:val="single" w:color="808080" w:sz="4"/>
-              <w:right w:val="single" w:color="808080" w:sz="4"/>
-            </w:tcBorders>
-            <w:tcMar>
-              <w:top w:type="dxa" w:w="50"/>
-              <w:left w:type="dxa" w:w="90"/>
-              <w:bottom w:type="dxa" w:w="50"/>
-              <w:right w:type="dxa" w:w="90"/>
-            </w:tcMar>
-          </w:tcPr>
-          <w:p>
-            <w:pPr>
-              <w:spacing w:after="0" w:before="0"/>
-            </w:pPr>
-            <w:r>
-              <w:rPr>
-                <w:rFonts w:ascii="Aptos Narrow" w:cs="Aptos Narrow" w:eastAsia="Aptos Narrow" w:hAnsi="Aptos Narrow"/>
-                <w:color w:val="1F1F1F"/>
-                <w:sz w:val="22"/>
-                <w:szCs w:val="22"/>
-              </w:rPr>
-              <w:t xml:space="preserve"/>
+              <w:t xml:space="preserve">Give your booklet to the teacher.</w:t>
             </w:r>
           </w:p>
         </w:tc>
@@ -2243,7 +2141,7 @@
                 <w:sz w:val="20"/>
                 <w:szCs w:val="20"/>
               </w:rPr>
-              <w:t xml:space="preserve">Table 3</w:t>
+              <w:t xml:space="preserve">Table 2</w:t>
             </w:r>
           </w:p>
           <w:p>
@@ -2257,7 +2155,7 @@
                 <w:sz w:val="19"/>
                 <w:szCs w:val="19"/>
               </w:rPr>
-              <w:t xml:space="preserve">Prime numbers are what is left when you have taken all the patterns away. I think prime numbers are like life. They are very logical but you could …</w:t>
+              <w:t xml:space="preserve">I find people confusing. This is for two main reasons. The first main reason is that people do a lot of talking without using any words.</w:t>
             </w:r>
           </w:p>
           <w:p>
@@ -2271,7 +2169,7 @@
                 <w:sz w:val="16"/>
                 <w:szCs w:val="16"/>
               </w:rPr>
-              <w:t xml:space="preserve">Chapter 19</w:t>
+              <w:t xml:space="preserve">Chapter 5</w:t>
             </w:r>
           </w:p>
         </w:tc>
@@ -2403,7 +2301,7 @@
                 <w:sz w:val="20"/>
                 <w:szCs w:val="20"/>
               </w:rPr>
-              <w:t xml:space="preserve">Table 4</w:t>
+              <w:t xml:space="preserve">Table 3</w:t>
             </w:r>
           </w:p>
           <w:p>
@@ -2417,7 +2315,7 @@
                 <w:sz w:val="19"/>
                 <w:szCs w:val="19"/>
               </w:rPr>
-              <w:t xml:space="preserve">I do not tell lies. Mother used to say that this was because I was a good person. But it is not because I am a good person. It is because I can't …</w:t>
+              <w:t xml:space="preserve">Prime numbers are what is left when you have taken all the patterns away. I think prime numbers are like life. They are very logical but you could …</w:t>
             </w:r>
           </w:p>
           <w:p>
@@ -2431,7 +2329,7 @@
                 <w:sz w:val="16"/>
                 <w:szCs w:val="16"/>
               </w:rPr>
-              <w:t xml:space="preserve">Chapter 37</w:t>
+              <w:t xml:space="preserve">Chapter 19</w:t>
             </w:r>
           </w:p>
         </w:tc>
@@ -2809,53 +2707,155 @@
         </w:trPr>
         <w:tc>
           <w:tcPr>
-            <w:tcW w:type="dxa" w:w="15398"/>
-            <w:gridSpan w:val="4"/>
-            <w:tcBorders>
-              <w:top w:val="single" w:color="808080" w:sz="4"/>
-              <w:left w:val="single" w:color="808080" w:sz="4"/>
-              <w:bottom w:val="single" w:color="808080" w:sz="4"/>
-              <w:right w:val="single" w:color="808080" w:sz="4"/>
-            </w:tcBorders>
-            <w:shd w:fill="F2F2F2" w:color="auto" w:val="clear"/>
-            <w:tcMar>
-              <w:top w:type="dxa" w:w="50"/>
-              <w:left w:type="dxa" w:w="90"/>
-              <w:bottom w:type="dxa" w:w="50"/>
-              <w:right w:type="dxa" w:w="90"/>
-            </w:tcMar>
-            <w:vAlign w:val="center"/>
-          </w:tcPr>
-          <w:p>
-            <w:pPr>
-              <w:spacing w:after="40" w:before="0"/>
-              <w:jc w:val="center"/>
-            </w:pPr>
-            <w:r>
-              <w:rPr>
-                <w:rFonts w:ascii="Aptos Narrow" w:cs="Aptos Narrow" w:eastAsia="Aptos Narrow" w:hAnsi="Aptos Narrow"/>
-                <w:b/>
-                <w:bCs/>
-                <w:color w:val="595959"/>
-                <w:sz w:val="22"/>
-                <w:szCs w:val="22"/>
-              </w:rPr>
-              <w:t xml:space="preserve">Table 1 · Teacher table</w:t>
-            </w:r>
-          </w:p>
-          <w:p>
-            <w:pPr>
-              <w:spacing w:after="0" w:before="0"/>
-              <w:jc w:val="center"/>
-            </w:pPr>
-            <w:r>
-              <w:rPr>
-                <w:rFonts w:ascii="Aptos Narrow" w:cs="Aptos Narrow" w:eastAsia="Aptos Narrow" w:hAnsi="Aptos Narrow"/>
-                <w:color w:val="595959"/>
+            <w:tcW w:type="dxa" w:w="4200"/>
+            <w:tcBorders>
+              <w:top w:val="single" w:color="808080" w:sz="4"/>
+              <w:left w:val="single" w:color="808080" w:sz="4"/>
+              <w:bottom w:val="single" w:color="808080" w:sz="4"/>
+              <w:right w:val="single" w:color="808080" w:sz="4"/>
+            </w:tcBorders>
+            <w:tcMar>
+              <w:top w:type="dxa" w:w="50"/>
+              <w:left w:type="dxa" w:w="90"/>
+              <w:bottom w:type="dxa" w:w="50"/>
+              <w:right w:type="dxa" w:w="90"/>
+            </w:tcMar>
+          </w:tcPr>
+          <w:p>
+            <w:pPr>
+              <w:spacing w:after="20" w:before="0"/>
+            </w:pPr>
+            <w:r>
+              <w:rPr>
+                <w:rFonts w:ascii="Aptos Narrow" w:cs="Aptos Narrow" w:eastAsia="Aptos Narrow" w:hAnsi="Aptos Narrow"/>
+                <w:b/>
+                <w:bCs/>
+                <w:color w:val="70243C"/>
                 <w:sz w:val="20"/>
                 <w:szCs w:val="20"/>
               </w:rPr>
-              <w:t xml:space="preserve">Give your booklet to the teacher.</w:t>
+              <w:t xml:space="preserve">Table 4</w:t>
+            </w:r>
+          </w:p>
+          <w:p>
+            <w:pPr>
+              <w:spacing w:after="20" w:before="0"/>
+            </w:pPr>
+            <w:r>
+              <w:rPr>
+                <w:rFonts w:ascii="Georgia" w:cs="Georgia" w:eastAsia="Georgia" w:hAnsi="Georgia"/>
+                <w:color w:val="1F1F1F"/>
+                <w:sz w:val="19"/>
+                <w:szCs w:val="19"/>
+              </w:rPr>
+              <w:t xml:space="preserve">I do not tell lies. Mother used to say that this was because I was a good person. But it is not because I am a good person. It is because I can't …</w:t>
+            </w:r>
+          </w:p>
+          <w:p>
+            <w:pPr>
+              <w:spacing w:after="0" w:before="0"/>
+            </w:pPr>
+            <w:r>
+              <w:rPr>
+                <w:rFonts w:ascii="Aptos Narrow" w:cs="Aptos Narrow" w:eastAsia="Aptos Narrow" w:hAnsi="Aptos Narrow"/>
+                <w:color w:val="595959"/>
+                <w:sz w:val="16"/>
+                <w:szCs w:val="16"/>
+              </w:rPr>
+              <w:t xml:space="preserve">Chapter 37</w:t>
+            </w:r>
+          </w:p>
+        </w:tc>
+        <w:tc>
+          <w:tcPr>
+            <w:tcW w:type="dxa" w:w="2300"/>
+            <w:tcBorders>
+              <w:top w:val="single" w:color="808080" w:sz="4"/>
+              <w:left w:val="single" w:color="808080" w:sz="4"/>
+              <w:bottom w:val="single" w:color="808080" w:sz="4"/>
+              <w:right w:val="single" w:color="808080" w:sz="4"/>
+            </w:tcBorders>
+            <w:tcMar>
+              <w:top w:type="dxa" w:w="50"/>
+              <w:left w:type="dxa" w:w="90"/>
+              <w:bottom w:type="dxa" w:w="50"/>
+              <w:right w:type="dxa" w:w="90"/>
+            </w:tcMar>
+          </w:tcPr>
+          <w:p>
+            <w:pPr>
+              <w:spacing w:after="0" w:before="0"/>
+            </w:pPr>
+            <w:r>
+              <w:rPr>
+                <w:rFonts w:ascii="Aptos Narrow" w:cs="Aptos Narrow" w:eastAsia="Aptos Narrow" w:hAnsi="Aptos Narrow"/>
+                <w:color w:val="1F1F1F"/>
+                <w:sz w:val="22"/>
+                <w:szCs w:val="22"/>
+              </w:rPr>
+              <w:t xml:space="preserve"/>
+            </w:r>
+          </w:p>
+        </w:tc>
+        <w:tc>
+          <w:tcPr>
+            <w:tcW w:type="dxa" w:w="5100"/>
+            <w:tcBorders>
+              <w:top w:val="single" w:color="808080" w:sz="4"/>
+              <w:left w:val="single" w:color="808080" w:sz="4"/>
+              <w:bottom w:val="single" w:color="808080" w:sz="4"/>
+              <w:right w:val="single" w:color="808080" w:sz="4"/>
+            </w:tcBorders>
+            <w:tcMar>
+              <w:top w:type="dxa" w:w="50"/>
+              <w:left w:type="dxa" w:w="90"/>
+              <w:bottom w:type="dxa" w:w="50"/>
+              <w:right w:type="dxa" w:w="90"/>
+            </w:tcMar>
+          </w:tcPr>
+          <w:p>
+            <w:pPr>
+              <w:spacing w:after="0" w:before="0"/>
+            </w:pPr>
+            <w:r>
+              <w:rPr>
+                <w:rFonts w:ascii="Aptos Narrow" w:cs="Aptos Narrow" w:eastAsia="Aptos Narrow" w:hAnsi="Aptos Narrow"/>
+                <w:color w:val="1F1F1F"/>
+                <w:sz w:val="22"/>
+                <w:szCs w:val="22"/>
+              </w:rPr>
+              <w:t xml:space="preserve"/>
+            </w:r>
+          </w:p>
+        </w:tc>
+        <w:tc>
+          <w:tcPr>
+            <w:tcW w:type="dxa" w:w="3798"/>
+            <w:tcBorders>
+              <w:top w:val="single" w:color="808080" w:sz="4"/>
+              <w:left w:val="single" w:color="808080" w:sz="4"/>
+              <w:bottom w:val="single" w:color="808080" w:sz="4"/>
+              <w:right w:val="single" w:color="808080" w:sz="4"/>
+            </w:tcBorders>
+            <w:tcMar>
+              <w:top w:type="dxa" w:w="50"/>
+              <w:left w:type="dxa" w:w="90"/>
+              <w:bottom w:type="dxa" w:w="50"/>
+              <w:right w:type="dxa" w:w="90"/>
+            </w:tcMar>
+          </w:tcPr>
+          <w:p>
+            <w:pPr>
+              <w:spacing w:after="0" w:before="0"/>
+            </w:pPr>
+            <w:r>
+              <w:rPr>
+                <w:rFonts w:ascii="Aptos Narrow" w:cs="Aptos Narrow" w:eastAsia="Aptos Narrow" w:hAnsi="Aptos Narrow"/>
+                <w:color w:val="1F1F1F"/>
+                <w:sz w:val="22"/>
+                <w:szCs w:val="22"/>
+              </w:rPr>
+              <w:t xml:space="preserve"/>
             </w:r>
           </w:p>
         </w:tc>
@@ -3460,141 +3460,53 @@
         </w:trPr>
         <w:tc>
           <w:tcPr>
-            <w:tcW w:type="dxa" w:w="4200"/>
-            <w:tcBorders>
-              <w:top w:val="single" w:color="808080" w:sz="4"/>
-              <w:left w:val="single" w:color="808080" w:sz="4"/>
-              <w:bottom w:val="single" w:color="808080" w:sz="4"/>
-              <w:right w:val="single" w:color="808080" w:sz="4"/>
-            </w:tcBorders>
-            <w:tcMar>
-              <w:top w:type="dxa" w:w="50"/>
-              <w:left w:type="dxa" w:w="90"/>
-              <w:bottom w:type="dxa" w:w="50"/>
-              <w:right w:type="dxa" w:w="90"/>
-            </w:tcMar>
-          </w:tcPr>
-          <w:p>
-            <w:pPr>
-              <w:spacing w:after="20" w:before="0"/>
-            </w:pPr>
-            <w:r>
-              <w:rPr>
-                <w:rFonts w:ascii="Aptos Narrow" w:cs="Aptos Narrow" w:eastAsia="Aptos Narrow" w:hAnsi="Aptos Narrow"/>
-                <w:b/>
-                <w:bCs/>
-                <w:color w:val="70243C"/>
+            <w:tcW w:type="dxa" w:w="15398"/>
+            <w:gridSpan w:val="4"/>
+            <w:tcBorders>
+              <w:top w:val="single" w:color="808080" w:sz="4"/>
+              <w:left w:val="single" w:color="808080" w:sz="4"/>
+              <w:bottom w:val="single" w:color="808080" w:sz="4"/>
+              <w:right w:val="single" w:color="808080" w:sz="4"/>
+            </w:tcBorders>
+            <w:shd w:fill="F2F2F2" w:color="auto" w:val="clear"/>
+            <w:tcMar>
+              <w:top w:type="dxa" w:w="50"/>
+              <w:left w:type="dxa" w:w="90"/>
+              <w:bottom w:type="dxa" w:w="50"/>
+              <w:right w:type="dxa" w:w="90"/>
+            </w:tcMar>
+            <w:vAlign w:val="center"/>
+          </w:tcPr>
+          <w:p>
+            <w:pPr>
+              <w:spacing w:after="40" w:before="0"/>
+              <w:jc w:val="center"/>
+            </w:pPr>
+            <w:r>
+              <w:rPr>
+                <w:rFonts w:ascii="Aptos Narrow" w:cs="Aptos Narrow" w:eastAsia="Aptos Narrow" w:hAnsi="Aptos Narrow"/>
+                <w:b/>
+                <w:bCs/>
+                <w:color w:val="595959"/>
+                <w:sz w:val="22"/>
+                <w:szCs w:val="22"/>
+              </w:rPr>
+              <w:t xml:space="preserve">Table 1 · Teacher table</w:t>
+            </w:r>
+          </w:p>
+          <w:p>
+            <w:pPr>
+              <w:spacing w:after="0" w:before="0"/>
+              <w:jc w:val="center"/>
+            </w:pPr>
+            <w:r>
+              <w:rPr>
+                <w:rFonts w:ascii="Aptos Narrow" w:cs="Aptos Narrow" w:eastAsia="Aptos Narrow" w:hAnsi="Aptos Narrow"/>
+                <w:color w:val="595959"/>
                 <w:sz w:val="20"/>
                 <w:szCs w:val="20"/>
               </w:rPr>
-              <w:t xml:space="preserve">Table 2</w:t>
-            </w:r>
-          </w:p>
-          <w:p>
-            <w:pPr>
-              <w:spacing w:after="20" w:before="0"/>
-            </w:pPr>
-            <w:r>
-              <w:rPr>
-                <w:rFonts w:ascii="Georgia" w:cs="Georgia" w:eastAsia="Georgia" w:hAnsi="Georgia"/>
-                <w:color w:val="1F1F1F"/>
-                <w:sz w:val="19"/>
-                <w:szCs w:val="19"/>
-              </w:rPr>
-              <w:t xml:space="preserve">Christopher's mother had every right to leave.</w:t>
-            </w:r>
-          </w:p>
-        </w:tc>
-        <w:tc>
-          <w:tcPr>
-            <w:tcW w:type="dxa" w:w="2300"/>
-            <w:tcBorders>
-              <w:top w:val="single" w:color="808080" w:sz="4"/>
-              <w:left w:val="single" w:color="808080" w:sz="4"/>
-              <w:bottom w:val="single" w:color="808080" w:sz="4"/>
-              <w:right w:val="single" w:color="808080" w:sz="4"/>
-            </w:tcBorders>
-            <w:tcMar>
-              <w:top w:type="dxa" w:w="50"/>
-              <w:left w:type="dxa" w:w="90"/>
-              <w:bottom w:type="dxa" w:w="50"/>
-              <w:right w:type="dxa" w:w="90"/>
-            </w:tcMar>
-          </w:tcPr>
-          <w:p>
-            <w:pPr>
-              <w:spacing w:after="0" w:before="0"/>
-            </w:pPr>
-            <w:r>
-              <w:rPr>
-                <w:rFonts w:ascii="Aptos Narrow" w:cs="Aptos Narrow" w:eastAsia="Aptos Narrow" w:hAnsi="Aptos Narrow"/>
-                <w:color w:val="1F1F1F"/>
-                <w:sz w:val="22"/>
-                <w:szCs w:val="22"/>
-              </w:rPr>
-              <w:t xml:space="preserve"/>
-            </w:r>
-          </w:p>
-        </w:tc>
-        <w:tc>
-          <w:tcPr>
-            <w:tcW w:type="dxa" w:w="5100"/>
-            <w:tcBorders>
-              <w:top w:val="single" w:color="808080" w:sz="4"/>
-              <w:left w:val="single" w:color="808080" w:sz="4"/>
-              <w:bottom w:val="single" w:color="808080" w:sz="4"/>
-              <w:right w:val="single" w:color="808080" w:sz="4"/>
-            </w:tcBorders>
-            <w:tcMar>
-              <w:top w:type="dxa" w:w="50"/>
-              <w:left w:type="dxa" w:w="90"/>
-              <w:bottom w:type="dxa" w:w="50"/>
-              <w:right w:type="dxa" w:w="90"/>
-            </w:tcMar>
-          </w:tcPr>
-          <w:p>
-            <w:pPr>
-              <w:spacing w:after="0" w:before="0"/>
-            </w:pPr>
-            <w:r>
-              <w:rPr>
-                <w:rFonts w:ascii="Aptos Narrow" w:cs="Aptos Narrow" w:eastAsia="Aptos Narrow" w:hAnsi="Aptos Narrow"/>
-                <w:color w:val="1F1F1F"/>
-                <w:sz w:val="22"/>
-                <w:szCs w:val="22"/>
-              </w:rPr>
-              <w:t xml:space="preserve"/>
-            </w:r>
-          </w:p>
-        </w:tc>
-        <w:tc>
-          <w:tcPr>
-            <w:tcW w:type="dxa" w:w="3798"/>
-            <w:tcBorders>
-              <w:top w:val="single" w:color="808080" w:sz="4"/>
-              <w:left w:val="single" w:color="808080" w:sz="4"/>
-              <w:bottom w:val="single" w:color="808080" w:sz="4"/>
-              <w:right w:val="single" w:color="808080" w:sz="4"/>
-            </w:tcBorders>
-            <w:tcMar>
-              <w:top w:type="dxa" w:w="50"/>
-              <w:left w:type="dxa" w:w="90"/>
-              <w:bottom w:type="dxa" w:w="50"/>
-              <w:right w:type="dxa" w:w="90"/>
-            </w:tcMar>
-          </w:tcPr>
-          <w:p>
-            <w:pPr>
-              <w:spacing w:after="0" w:before="0"/>
-            </w:pPr>
-            <w:r>
-              <w:rPr>
-                <w:rFonts w:ascii="Aptos Narrow" w:cs="Aptos Narrow" w:eastAsia="Aptos Narrow" w:hAnsi="Aptos Narrow"/>
-                <w:color w:val="1F1F1F"/>
-                <w:sz w:val="22"/>
-                <w:szCs w:val="22"/>
-              </w:rPr>
-              <w:t xml:space="preserve"/>
+              <w:t xml:space="preserve">Give your booklet to the teacher.</w:t>
             </w:r>
           </w:p>
         </w:tc>
@@ -3633,7 +3545,7 @@
                 <w:sz w:val="20"/>
                 <w:szCs w:val="20"/>
               </w:rPr>
-              <w:t xml:space="preserve">Table 3</w:t>
+              <w:t xml:space="preserve">Table 2</w:t>
             </w:r>
           </w:p>
           <w:p>
@@ -3647,7 +3559,7 @@
                 <w:sz w:val="19"/>
                 <w:szCs w:val="19"/>
               </w:rPr>
-              <w:t xml:space="preserve">If everyone told the truth all the time, like Christopher, the world would be a better place.</w:t>
+              <w:t xml:space="preserve">Christopher's mother had every right to leave.</w:t>
             </w:r>
           </w:p>
         </w:tc>
@@ -3779,7 +3691,7 @@
                 <w:sz w:val="20"/>
                 <w:szCs w:val="20"/>
               </w:rPr>
-              <w:t xml:space="preserve">Table 4</w:t>
+              <w:t xml:space="preserve">Table 3</w:t>
             </w:r>
           </w:p>
           <w:p>
@@ -3793,7 +3705,7 @@
                 <w:sz w:val="19"/>
                 <w:szCs w:val="19"/>
               </w:rPr>
-              <w:t xml:space="preserve">The adults in this novel have more 'behavioural problems' than Christopher does.</w:t>
+              <w:t xml:space="preserve">If everyone told the truth all the time, like Christopher, the world would be a better place.</w:t>
             </w:r>
           </w:p>
         </w:tc>
@@ -4171,53 +4083,141 @@
         </w:trPr>
         <w:tc>
           <w:tcPr>
-            <w:tcW w:type="dxa" w:w="15398"/>
-            <w:gridSpan w:val="4"/>
-            <w:tcBorders>
-              <w:top w:val="single" w:color="808080" w:sz="4"/>
-              <w:left w:val="single" w:color="808080" w:sz="4"/>
-              <w:bottom w:val="single" w:color="808080" w:sz="4"/>
-              <w:right w:val="single" w:color="808080" w:sz="4"/>
-            </w:tcBorders>
-            <w:shd w:fill="F2F2F2" w:color="auto" w:val="clear"/>
-            <w:tcMar>
-              <w:top w:type="dxa" w:w="50"/>
-              <w:left w:type="dxa" w:w="90"/>
-              <w:bottom w:type="dxa" w:w="50"/>
-              <w:right w:type="dxa" w:w="90"/>
-            </w:tcMar>
-            <w:vAlign w:val="center"/>
-          </w:tcPr>
-          <w:p>
-            <w:pPr>
-              <w:spacing w:after="40" w:before="0"/>
-              <w:jc w:val="center"/>
-            </w:pPr>
-            <w:r>
-              <w:rPr>
-                <w:rFonts w:ascii="Aptos Narrow" w:cs="Aptos Narrow" w:eastAsia="Aptos Narrow" w:hAnsi="Aptos Narrow"/>
-                <w:b/>
-                <w:bCs/>
-                <w:color w:val="595959"/>
-                <w:sz w:val="22"/>
-                <w:szCs w:val="22"/>
-              </w:rPr>
-              <w:t xml:space="preserve">Table 1 · Teacher table</w:t>
-            </w:r>
-          </w:p>
-          <w:p>
-            <w:pPr>
-              <w:spacing w:after="0" w:before="0"/>
-              <w:jc w:val="center"/>
-            </w:pPr>
-            <w:r>
-              <w:rPr>
-                <w:rFonts w:ascii="Aptos Narrow" w:cs="Aptos Narrow" w:eastAsia="Aptos Narrow" w:hAnsi="Aptos Narrow"/>
-                <w:color w:val="595959"/>
+            <w:tcW w:type="dxa" w:w="4200"/>
+            <w:tcBorders>
+              <w:top w:val="single" w:color="808080" w:sz="4"/>
+              <w:left w:val="single" w:color="808080" w:sz="4"/>
+              <w:bottom w:val="single" w:color="808080" w:sz="4"/>
+              <w:right w:val="single" w:color="808080" w:sz="4"/>
+            </w:tcBorders>
+            <w:tcMar>
+              <w:top w:type="dxa" w:w="50"/>
+              <w:left w:type="dxa" w:w="90"/>
+              <w:bottom w:type="dxa" w:w="50"/>
+              <w:right w:type="dxa" w:w="90"/>
+            </w:tcMar>
+          </w:tcPr>
+          <w:p>
+            <w:pPr>
+              <w:spacing w:after="20" w:before="0"/>
+            </w:pPr>
+            <w:r>
+              <w:rPr>
+                <w:rFonts w:ascii="Aptos Narrow" w:cs="Aptos Narrow" w:eastAsia="Aptos Narrow" w:hAnsi="Aptos Narrow"/>
+                <w:b/>
+                <w:bCs/>
+                <w:color w:val="70243C"/>
                 <w:sz w:val="20"/>
                 <w:szCs w:val="20"/>
               </w:rPr>
-              <w:t xml:space="preserve">Give your booklet to the teacher.</w:t>
+              <w:t xml:space="preserve">Table 4</w:t>
+            </w:r>
+          </w:p>
+          <w:p>
+            <w:pPr>
+              <w:spacing w:after="20" w:before="0"/>
+            </w:pPr>
+            <w:r>
+              <w:rPr>
+                <w:rFonts w:ascii="Georgia" w:cs="Georgia" w:eastAsia="Georgia" w:hAnsi="Georgia"/>
+                <w:color w:val="1F1F1F"/>
+                <w:sz w:val="19"/>
+                <w:szCs w:val="19"/>
+              </w:rPr>
+              <w:t xml:space="preserve">The adults in this novel have more 'behavioural problems' than Christopher does.</w:t>
+            </w:r>
+          </w:p>
+        </w:tc>
+        <w:tc>
+          <w:tcPr>
+            <w:tcW w:type="dxa" w:w="2300"/>
+            <w:tcBorders>
+              <w:top w:val="single" w:color="808080" w:sz="4"/>
+              <w:left w:val="single" w:color="808080" w:sz="4"/>
+              <w:bottom w:val="single" w:color="808080" w:sz="4"/>
+              <w:right w:val="single" w:color="808080" w:sz="4"/>
+            </w:tcBorders>
+            <w:tcMar>
+              <w:top w:type="dxa" w:w="50"/>
+              <w:left w:type="dxa" w:w="90"/>
+              <w:bottom w:type="dxa" w:w="50"/>
+              <w:right w:type="dxa" w:w="90"/>
+            </w:tcMar>
+          </w:tcPr>
+          <w:p>
+            <w:pPr>
+              <w:spacing w:after="0" w:before="0"/>
+            </w:pPr>
+            <w:r>
+              <w:rPr>
+                <w:rFonts w:ascii="Aptos Narrow" w:cs="Aptos Narrow" w:eastAsia="Aptos Narrow" w:hAnsi="Aptos Narrow"/>
+                <w:color w:val="1F1F1F"/>
+                <w:sz w:val="22"/>
+                <w:szCs w:val="22"/>
+              </w:rPr>
+              <w:t xml:space="preserve"/>
+            </w:r>
+          </w:p>
+        </w:tc>
+        <w:tc>
+          <w:tcPr>
+            <w:tcW w:type="dxa" w:w="5100"/>
+            <w:tcBorders>
+              <w:top w:val="single" w:color="808080" w:sz="4"/>
+              <w:left w:val="single" w:color="808080" w:sz="4"/>
+              <w:bottom w:val="single" w:color="808080" w:sz="4"/>
+              <w:right w:val="single" w:color="808080" w:sz="4"/>
+            </w:tcBorders>
+            <w:tcMar>
+              <w:top w:type="dxa" w:w="50"/>
+              <w:left w:type="dxa" w:w="90"/>
+              <w:bottom w:type="dxa" w:w="50"/>
+              <w:right w:type="dxa" w:w="90"/>
+            </w:tcMar>
+          </w:tcPr>
+          <w:p>
+            <w:pPr>
+              <w:spacing w:after="0" w:before="0"/>
+            </w:pPr>
+            <w:r>
+              <w:rPr>
+                <w:rFonts w:ascii="Aptos Narrow" w:cs="Aptos Narrow" w:eastAsia="Aptos Narrow" w:hAnsi="Aptos Narrow"/>
+                <w:color w:val="1F1F1F"/>
+                <w:sz w:val="22"/>
+                <w:szCs w:val="22"/>
+              </w:rPr>
+              <w:t xml:space="preserve"/>
+            </w:r>
+          </w:p>
+        </w:tc>
+        <w:tc>
+          <w:tcPr>
+            <w:tcW w:type="dxa" w:w="3798"/>
+            <w:tcBorders>
+              <w:top w:val="single" w:color="808080" w:sz="4"/>
+              <w:left w:val="single" w:color="808080" w:sz="4"/>
+              <w:bottom w:val="single" w:color="808080" w:sz="4"/>
+              <w:right w:val="single" w:color="808080" w:sz="4"/>
+            </w:tcBorders>
+            <w:tcMar>
+              <w:top w:type="dxa" w:w="50"/>
+              <w:left w:type="dxa" w:w="90"/>
+              <w:bottom w:type="dxa" w:w="50"/>
+              <w:right w:type="dxa" w:w="90"/>
+            </w:tcMar>
+          </w:tcPr>
+          <w:p>
+            <w:pPr>
+              <w:spacing w:after="0" w:before="0"/>
+            </w:pPr>
+            <w:r>
+              <w:rPr>
+                <w:rFonts w:ascii="Aptos Narrow" w:cs="Aptos Narrow" w:eastAsia="Aptos Narrow" w:hAnsi="Aptos Narrow"/>
+                <w:color w:val="1F1F1F"/>
+                <w:sz w:val="22"/>
+                <w:szCs w:val="22"/>
+              </w:rPr>
+              <w:t xml:space="preserve"/>
             </w:r>
           </w:p>
         </w:tc>
@@ -4794,155 +4794,53 @@
         </w:trPr>
         <w:tc>
           <w:tcPr>
-            <w:tcW w:type="dxa" w:w="4200"/>
-            <w:tcBorders>
-              <w:top w:val="single" w:color="808080" w:sz="4"/>
-              <w:left w:val="single" w:color="808080" w:sz="4"/>
-              <w:bottom w:val="single" w:color="808080" w:sz="4"/>
-              <w:right w:val="single" w:color="808080" w:sz="4"/>
-            </w:tcBorders>
-            <w:tcMar>
-              <w:top w:type="dxa" w:w="50"/>
-              <w:left w:type="dxa" w:w="90"/>
-              <w:bottom w:type="dxa" w:w="50"/>
-              <w:right w:type="dxa" w:w="90"/>
-            </w:tcMar>
-          </w:tcPr>
-          <w:p>
-            <w:pPr>
-              <w:spacing w:after="20" w:before="0"/>
-            </w:pPr>
-            <w:r>
-              <w:rPr>
-                <w:rFonts w:ascii="Aptos Narrow" w:cs="Aptos Narrow" w:eastAsia="Aptos Narrow" w:hAnsi="Aptos Narrow"/>
-                <w:b/>
-                <w:bCs/>
-                <w:color w:val="70243C"/>
+            <w:tcW w:type="dxa" w:w="15398"/>
+            <w:gridSpan w:val="4"/>
+            <w:tcBorders>
+              <w:top w:val="single" w:color="808080" w:sz="4"/>
+              <w:left w:val="single" w:color="808080" w:sz="4"/>
+              <w:bottom w:val="single" w:color="808080" w:sz="4"/>
+              <w:right w:val="single" w:color="808080" w:sz="4"/>
+            </w:tcBorders>
+            <w:shd w:fill="F2F2F2" w:color="auto" w:val="clear"/>
+            <w:tcMar>
+              <w:top w:type="dxa" w:w="50"/>
+              <w:left w:type="dxa" w:w="90"/>
+              <w:bottom w:type="dxa" w:w="50"/>
+              <w:right w:type="dxa" w:w="90"/>
+            </w:tcMar>
+            <w:vAlign w:val="center"/>
+          </w:tcPr>
+          <w:p>
+            <w:pPr>
+              <w:spacing w:after="40" w:before="0"/>
+              <w:jc w:val="center"/>
+            </w:pPr>
+            <w:r>
+              <w:rPr>
+                <w:rFonts w:ascii="Aptos Narrow" w:cs="Aptos Narrow" w:eastAsia="Aptos Narrow" w:hAnsi="Aptos Narrow"/>
+                <w:b/>
+                <w:bCs/>
+                <w:color w:val="595959"/>
+                <w:sz w:val="22"/>
+                <w:szCs w:val="22"/>
+              </w:rPr>
+              <w:t xml:space="preserve">Table 1 · Teacher table</w:t>
+            </w:r>
+          </w:p>
+          <w:p>
+            <w:pPr>
+              <w:spacing w:after="0" w:before="0"/>
+              <w:jc w:val="center"/>
+            </w:pPr>
+            <w:r>
+              <w:rPr>
+                <w:rFonts w:ascii="Aptos Narrow" w:cs="Aptos Narrow" w:eastAsia="Aptos Narrow" w:hAnsi="Aptos Narrow"/>
+                <w:color w:val="595959"/>
                 <w:sz w:val="20"/>
                 <w:szCs w:val="20"/>
               </w:rPr>
-              <w:t xml:space="preserve">Table 2</w:t>
-            </w:r>
-          </w:p>
-          <w:p>
-            <w:pPr>
-              <w:spacing w:after="20" w:before="0"/>
-            </w:pPr>
-            <w:r>
-              <w:rPr>
-                <w:rFonts w:ascii="Georgia" w:cs="Georgia" w:eastAsia="Georgia" w:hAnsi="Georgia"/>
-                <w:color w:val="1F1F1F"/>
-                <w:sz w:val="19"/>
-                <w:szCs w:val="19"/>
-              </w:rPr>
-              <w:t xml:space="preserve">Christopher lists his Behavioural Problems.</w:t>
-            </w:r>
-          </w:p>
-          <w:p>
-            <w:pPr>
-              <w:spacing w:after="0" w:before="0"/>
-            </w:pPr>
-            <w:r>
-              <w:rPr>
-                <w:rFonts w:ascii="Aptos Narrow" w:cs="Aptos Narrow" w:eastAsia="Aptos Narrow" w:hAnsi="Aptos Narrow"/>
-                <w:color w:val="595959"/>
-                <w:sz w:val="16"/>
-                <w:szCs w:val="16"/>
-              </w:rPr>
-              <w:t xml:space="preserve">Chapter 73, the list from A to R</w:t>
-            </w:r>
-          </w:p>
-        </w:tc>
-        <w:tc>
-          <w:tcPr>
-            <w:tcW w:type="dxa" w:w="2300"/>
-            <w:tcBorders>
-              <w:top w:val="single" w:color="808080" w:sz="4"/>
-              <w:left w:val="single" w:color="808080" w:sz="4"/>
-              <w:bottom w:val="single" w:color="808080" w:sz="4"/>
-              <w:right w:val="single" w:color="808080" w:sz="4"/>
-            </w:tcBorders>
-            <w:tcMar>
-              <w:top w:type="dxa" w:w="50"/>
-              <w:left w:type="dxa" w:w="90"/>
-              <w:bottom w:type="dxa" w:w="50"/>
-              <w:right w:type="dxa" w:w="90"/>
-            </w:tcMar>
-          </w:tcPr>
-          <w:p>
-            <w:pPr>
-              <w:spacing w:after="0" w:before="0"/>
-            </w:pPr>
-            <w:r>
-              <w:rPr>
-                <w:rFonts w:ascii="Aptos Narrow" w:cs="Aptos Narrow" w:eastAsia="Aptos Narrow" w:hAnsi="Aptos Narrow"/>
-                <w:color w:val="1F1F1F"/>
-                <w:sz w:val="22"/>
-                <w:szCs w:val="22"/>
-              </w:rPr>
-              <w:t xml:space="preserve"/>
-            </w:r>
-          </w:p>
-        </w:tc>
-        <w:tc>
-          <w:tcPr>
-            <w:tcW w:type="dxa" w:w="5100"/>
-            <w:tcBorders>
-              <w:top w:val="single" w:color="808080" w:sz="4"/>
-              <w:left w:val="single" w:color="808080" w:sz="4"/>
-              <w:bottom w:val="single" w:color="808080" w:sz="4"/>
-              <w:right w:val="single" w:color="808080" w:sz="4"/>
-            </w:tcBorders>
-            <w:tcMar>
-              <w:top w:type="dxa" w:w="50"/>
-              <w:left w:type="dxa" w:w="90"/>
-              <w:bottom w:type="dxa" w:w="50"/>
-              <w:right w:type="dxa" w:w="90"/>
-            </w:tcMar>
-          </w:tcPr>
-          <w:p>
-            <w:pPr>
-              <w:spacing w:after="0" w:before="0"/>
-            </w:pPr>
-            <w:r>
-              <w:rPr>
-                <w:rFonts w:ascii="Aptos Narrow" w:cs="Aptos Narrow" w:eastAsia="Aptos Narrow" w:hAnsi="Aptos Narrow"/>
-                <w:color w:val="1F1F1F"/>
-                <w:sz w:val="22"/>
-                <w:szCs w:val="22"/>
-              </w:rPr>
-              <w:t xml:space="preserve"/>
-            </w:r>
-          </w:p>
-        </w:tc>
-        <w:tc>
-          <w:tcPr>
-            <w:tcW w:type="dxa" w:w="3798"/>
-            <w:tcBorders>
-              <w:top w:val="single" w:color="808080" w:sz="4"/>
-              <w:left w:val="single" w:color="808080" w:sz="4"/>
-              <w:bottom w:val="single" w:color="808080" w:sz="4"/>
-              <w:right w:val="single" w:color="808080" w:sz="4"/>
-            </w:tcBorders>
-            <w:tcMar>
-              <w:top w:type="dxa" w:w="50"/>
-              <w:left w:type="dxa" w:w="90"/>
-              <w:bottom w:type="dxa" w:w="50"/>
-              <w:right w:type="dxa" w:w="90"/>
-            </w:tcMar>
-          </w:tcPr>
-          <w:p>
-            <w:pPr>
-              <w:spacing w:after="0" w:before="0"/>
-            </w:pPr>
-            <w:r>
-              <w:rPr>
-                <w:rFonts w:ascii="Aptos Narrow" w:cs="Aptos Narrow" w:eastAsia="Aptos Narrow" w:hAnsi="Aptos Narrow"/>
-                <w:color w:val="1F1F1F"/>
-                <w:sz w:val="22"/>
-                <w:szCs w:val="22"/>
-              </w:rPr>
-              <w:t xml:space="preserve"/>
+              <w:t xml:space="preserve">Give your booklet to the teacher.</w:t>
             </w:r>
           </w:p>
         </w:tc>
@@ -4981,7 +4879,7 @@
                 <w:sz w:val="20"/>
                 <w:szCs w:val="20"/>
               </w:rPr>
-              <w:t xml:space="preserve">Table 3</w:t>
+              <w:t xml:space="preserve">Table 2</w:t>
             </w:r>
           </w:p>
           <w:p>
@@ -4995,7 +4893,7 @@
                 <w:sz w:val="19"/>
                 <w:szCs w:val="19"/>
               </w:rPr>
-              <w:t xml:space="preserve">Christopher reads his mother's letters.</w:t>
+              <w:t xml:space="preserve">Christopher lists his Behavioural Problems.</w:t>
             </w:r>
           </w:p>
           <w:p>
@@ -5009,7 +4907,7 @@
                 <w:sz w:val="16"/>
                 <w:szCs w:val="16"/>
               </w:rPr>
-              <w:t xml:space="preserve">Chapter 157</w:t>
+              <w:t xml:space="preserve">Chapter 73, the list from A to R</w:t>
             </w:r>
           </w:p>
         </w:tc>
@@ -5141,7 +5039,7 @@
                 <w:sz w:val="20"/>
                 <w:szCs w:val="20"/>
               </w:rPr>
-              <w:t xml:space="preserve">Table 4</w:t>
+              <w:t xml:space="preserve">Table 3</w:t>
             </w:r>
           </w:p>
           <w:p>
@@ -5155,7 +5053,7 @@
                 <w:sz w:val="19"/>
                 <w:szCs w:val="19"/>
               </w:rPr>
-              <w:t xml:space="preserve">Father tells the truth about Wellington.</w:t>
+              <w:t xml:space="preserve">Christopher reads his mother's letters.</w:t>
             </w:r>
           </w:p>
           <w:p>
@@ -5169,7 +5067,7 @@
                 <w:sz w:val="16"/>
                 <w:szCs w:val="16"/>
               </w:rPr>
-              <w:t xml:space="preserve">Chapter 167</w:t>
+              <w:t xml:space="preserve">Chapter 157</w:t>
             </w:r>
           </w:p>
         </w:tc>
@@ -5547,53 +5445,155 @@
         </w:trPr>
         <w:tc>
           <w:tcPr>
-            <w:tcW w:type="dxa" w:w="15398"/>
-            <w:gridSpan w:val="4"/>
-            <w:tcBorders>
-              <w:top w:val="single" w:color="808080" w:sz="4"/>
-              <w:left w:val="single" w:color="808080" w:sz="4"/>
-              <w:bottom w:val="single" w:color="808080" w:sz="4"/>
-              <w:right w:val="single" w:color="808080" w:sz="4"/>
-            </w:tcBorders>
-            <w:shd w:fill="F2F2F2" w:color="auto" w:val="clear"/>
-            <w:tcMar>
-              <w:top w:type="dxa" w:w="50"/>
-              <w:left w:type="dxa" w:w="90"/>
-              <w:bottom w:type="dxa" w:w="50"/>
-              <w:right w:type="dxa" w:w="90"/>
-            </w:tcMar>
-            <w:vAlign w:val="center"/>
-          </w:tcPr>
-          <w:p>
-            <w:pPr>
-              <w:spacing w:after="40" w:before="0"/>
-              <w:jc w:val="center"/>
-            </w:pPr>
-            <w:r>
-              <w:rPr>
-                <w:rFonts w:ascii="Aptos Narrow" w:cs="Aptos Narrow" w:eastAsia="Aptos Narrow" w:hAnsi="Aptos Narrow"/>
-                <w:b/>
-                <w:bCs/>
-                <w:color w:val="595959"/>
-                <w:sz w:val="22"/>
-                <w:szCs w:val="22"/>
-              </w:rPr>
-              <w:t xml:space="preserve">Table 1 · Teacher table</w:t>
-            </w:r>
-          </w:p>
-          <w:p>
-            <w:pPr>
-              <w:spacing w:after="0" w:before="0"/>
-              <w:jc w:val="center"/>
-            </w:pPr>
-            <w:r>
-              <w:rPr>
-                <w:rFonts w:ascii="Aptos Narrow" w:cs="Aptos Narrow" w:eastAsia="Aptos Narrow" w:hAnsi="Aptos Narrow"/>
-                <w:color w:val="595959"/>
+            <w:tcW w:type="dxa" w:w="4200"/>
+            <w:tcBorders>
+              <w:top w:val="single" w:color="808080" w:sz="4"/>
+              <w:left w:val="single" w:color="808080" w:sz="4"/>
+              <w:bottom w:val="single" w:color="808080" w:sz="4"/>
+              <w:right w:val="single" w:color="808080" w:sz="4"/>
+            </w:tcBorders>
+            <w:tcMar>
+              <w:top w:type="dxa" w:w="50"/>
+              <w:left w:type="dxa" w:w="90"/>
+              <w:bottom w:type="dxa" w:w="50"/>
+              <w:right w:type="dxa" w:w="90"/>
+            </w:tcMar>
+          </w:tcPr>
+          <w:p>
+            <w:pPr>
+              <w:spacing w:after="20" w:before="0"/>
+            </w:pPr>
+            <w:r>
+              <w:rPr>
+                <w:rFonts w:ascii="Aptos Narrow" w:cs="Aptos Narrow" w:eastAsia="Aptos Narrow" w:hAnsi="Aptos Narrow"/>
+                <w:b/>
+                <w:bCs/>
+                <w:color w:val="70243C"/>
                 <w:sz w:val="20"/>
                 <w:szCs w:val="20"/>
               </w:rPr>
-              <w:t xml:space="preserve">Give your booklet to the teacher.</w:t>
+              <w:t xml:space="preserve">Table 4</w:t>
+            </w:r>
+          </w:p>
+          <w:p>
+            <w:pPr>
+              <w:spacing w:after="20" w:before="0"/>
+            </w:pPr>
+            <w:r>
+              <w:rPr>
+                <w:rFonts w:ascii="Georgia" w:cs="Georgia" w:eastAsia="Georgia" w:hAnsi="Georgia"/>
+                <w:color w:val="1F1F1F"/>
+                <w:sz w:val="19"/>
+                <w:szCs w:val="19"/>
+              </w:rPr>
+              <w:t xml:space="preserve">Father tells the truth about Wellington.</w:t>
+            </w:r>
+          </w:p>
+          <w:p>
+            <w:pPr>
+              <w:spacing w:after="0" w:before="0"/>
+            </w:pPr>
+            <w:r>
+              <w:rPr>
+                <w:rFonts w:ascii="Aptos Narrow" w:cs="Aptos Narrow" w:eastAsia="Aptos Narrow" w:hAnsi="Aptos Narrow"/>
+                <w:color w:val="595959"/>
+                <w:sz w:val="16"/>
+                <w:szCs w:val="16"/>
+              </w:rPr>
+              <w:t xml:space="preserve">Chapter 167</w:t>
+            </w:r>
+          </w:p>
+        </w:tc>
+        <w:tc>
+          <w:tcPr>
+            <w:tcW w:type="dxa" w:w="2300"/>
+            <w:tcBorders>
+              <w:top w:val="single" w:color="808080" w:sz="4"/>
+              <w:left w:val="single" w:color="808080" w:sz="4"/>
+              <w:bottom w:val="single" w:color="808080" w:sz="4"/>
+              <w:right w:val="single" w:color="808080" w:sz="4"/>
+            </w:tcBorders>
+            <w:tcMar>
+              <w:top w:type="dxa" w:w="50"/>
+              <w:left w:type="dxa" w:w="90"/>
+              <w:bottom w:type="dxa" w:w="50"/>
+              <w:right w:type="dxa" w:w="90"/>
+            </w:tcMar>
+          </w:tcPr>
+          <w:p>
+            <w:pPr>
+              <w:spacing w:after="0" w:before="0"/>
+            </w:pPr>
+            <w:r>
+              <w:rPr>
+                <w:rFonts w:ascii="Aptos Narrow" w:cs="Aptos Narrow" w:eastAsia="Aptos Narrow" w:hAnsi="Aptos Narrow"/>
+                <w:color w:val="1F1F1F"/>
+                <w:sz w:val="22"/>
+                <w:szCs w:val="22"/>
+              </w:rPr>
+              <w:t xml:space="preserve"/>
+            </w:r>
+          </w:p>
+        </w:tc>
+        <w:tc>
+          <w:tcPr>
+            <w:tcW w:type="dxa" w:w="5100"/>
+            <w:tcBorders>
+              <w:top w:val="single" w:color="808080" w:sz="4"/>
+              <w:left w:val="single" w:color="808080" w:sz="4"/>
+              <w:bottom w:val="single" w:color="808080" w:sz="4"/>
+              <w:right w:val="single" w:color="808080" w:sz="4"/>
+            </w:tcBorders>
+            <w:tcMar>
+              <w:top w:type="dxa" w:w="50"/>
+              <w:left w:type="dxa" w:w="90"/>
+              <w:bottom w:type="dxa" w:w="50"/>
+              <w:right w:type="dxa" w:w="90"/>
+            </w:tcMar>
+          </w:tcPr>
+          <w:p>
+            <w:pPr>
+              <w:spacing w:after="0" w:before="0"/>
+            </w:pPr>
+            <w:r>
+              <w:rPr>
+                <w:rFonts w:ascii="Aptos Narrow" w:cs="Aptos Narrow" w:eastAsia="Aptos Narrow" w:hAnsi="Aptos Narrow"/>
+                <w:color w:val="1F1F1F"/>
+                <w:sz w:val="22"/>
+                <w:szCs w:val="22"/>
+              </w:rPr>
+              <w:t xml:space="preserve"/>
+            </w:r>
+          </w:p>
+        </w:tc>
+        <w:tc>
+          <w:tcPr>
+            <w:tcW w:type="dxa" w:w="3798"/>
+            <w:tcBorders>
+              <w:top w:val="single" w:color="808080" w:sz="4"/>
+              <w:left w:val="single" w:color="808080" w:sz="4"/>
+              <w:bottom w:val="single" w:color="808080" w:sz="4"/>
+              <w:right w:val="single" w:color="808080" w:sz="4"/>
+            </w:tcBorders>
+            <w:tcMar>
+              <w:top w:type="dxa" w:w="50"/>
+              <w:left w:type="dxa" w:w="90"/>
+              <w:bottom w:type="dxa" w:w="50"/>
+              <w:right w:type="dxa" w:w="90"/>
+            </w:tcMar>
+          </w:tcPr>
+          <w:p>
+            <w:pPr>
+              <w:spacing w:after="0" w:before="0"/>
+            </w:pPr>
+            <w:r>
+              <w:rPr>
+                <w:rFonts w:ascii="Aptos Narrow" w:cs="Aptos Narrow" w:eastAsia="Aptos Narrow" w:hAnsi="Aptos Narrow"/>
+                <w:color w:val="1F1F1F"/>
+                <w:sz w:val="22"/>
+                <w:szCs w:val="22"/>
+              </w:rPr>
+              <w:t xml:space="preserve"/>
             </w:r>
           </w:p>
         </w:tc>

</xml_diff>